<commit_message>
Disclose AI use only in Methods 4.9; make no methods-review claim
At the authors' direction the paper no longer states that its methods were
reviewed, by anyone. S2 Appendix, which logged the review rounds, is removed
from the package, along with the pointer to it in 4.9, the "added after review"
note in 2.4.1 and the "after a methods review" clause in 4.7.

The AI-use disclosure in Methods 4.9 is unchanged and now carries verifier
checks requiring it: it states that data exploration, analysis and manuscript
writing were supported by AI-based tools, names the interface and date range,
and lists adversarial review of the authors' own claims among their uses. Two
further checks bar any methods-review claim from reappearing.

Process attributions are also removed from NUMBERS.md, which is deposited
publicly. The numerical provenance is unchanged; only the framing that implied
an external review process is gone.

161 of 161 checks.

Co-Authored-By: Claude Opus 5 <noreply@anthropic.com>
</commit_message>
<xml_diff>
--- a/manuscript/paper_current.docx
+++ b/manuscript/paper_current.docx
@@ -4409,7 +4409,7 @@
           <w:color w:val="000000"/>
           <w:sz w:val="20"/>
         </w:rPr>
-        <w:t>Added after review. The declared predictor takes the shortest separation between any non-hydrogen atoms of the two residues, backbone included, and none of the comparators above is a better-specified version of the same idea; they are different ideas. The phosphate attaches to the side-chain tip, and that tip and the charge it carries are the mechanism the heuristic is about, so the sharper test is to measure from the accepting oxygen alone.</w:t>
+        <w:t>The declared predictor takes the shortest separation between any non-hydrogen atoms of the two residues, backbone included, and none of the comparators above is a better-specified version of the same idea; they are different ideas. The phosphate attaches to the side-chain tip, and that tip and the charge it carries are the mechanism the heuristic is about, so the sharper test is to measure from the accepting oxygen alone.</w:t>
       </w:r>
     </w:p>
     <w:p>
@@ -11631,7 +11631,7 @@
           <w:color w:val="000000"/>
           <w:sz w:val="20"/>
         </w:rPr>
-        <w:t>Sites whose nearest annotated target is the site itself are excluded from the primary cohort. That decision was made after the outcome had been inspected, so it is post hoc, and the inclusive cohort — which keeps those three sites at their literal distance of 0 Å — is reported alongside the primary rather than only where it would change a reading. An earlier build of this cohort was superseded after a methods review; what changed, and why, is recorded in the deposited materials.</w:t>
+        <w:t>Sites whose nearest annotated target is the site itself are excluded from the primary cohort. That decision was made after the outcome had been inspected, so it is post hoc, and the inclusive cohort — which keeps those three sites at their literal distance of 0 Å — is reported alongside the primary rather than only where it would change a reading. An earlier build of this cohort was superseded; what changed, and why, is recorded in the deposited materials.</w:t>
       </w:r>
     </w:p>
     <w:p>
@@ -12809,7 +12809,7 @@
           <w:color w:val="000000"/>
           <w:sz w:val="20"/>
         </w:rPr>
-        <w:t>The tools were large language models used through Anthropic's Claude Code interface between 2026-07 and 2026-08. Their outputs were used for prose drafting, code drafting, literature search and adversarial review of the authors' own claims. Every number reported in this manuscript was recomputed from the deposited code and checked against the numerical authority before it was written, and several claims produced with that assistance were retracted on recomputation; those retractions are recorded in the analysis materials. The authors take responsibility for the accuracy of all content, and the interpretations and conclusions are their own. S2 Appendix records the adversarial review rounds that were run, what each produced, and the fact that none of it constitutes peer review.</w:t>
+        <w:t>The tools were large language models used through Anthropic's Claude Code interface between 2026-07 and 2026-08. Their outputs were used for prose drafting, code drafting, literature search and adversarial review of the authors' own claims. Every number reported in this manuscript was recomputed from the deposited code and checked against the numerical authority before it was written, and several claims produced with that assistance were retracted on recomputation; those retractions are recorded in the analysis materials. The authors take responsibility for the accuracy of all content, and the interpretations and conclusions are their own.</w:t>
       </w:r>
     </w:p>
     <w:p>
@@ -13818,32 +13818,6 @@
           <w:sz w:val="20"/>
         </w:rPr>
         <w:t xml:space="preserve"> The eleven-stratum confidence family, tabulated. Both cohort versions across every stratum, with sites and intervals. All post hoc.</w:t>
-      </w:r>
-    </w:p>
-    <w:p>
-      <w:pPr>
-        <w:spacing w:before="0" w:after="200" w:line="284" w:lineRule="exact"/>
-        <w:jc w:val="left"/>
-      </w:pPr>
-      <w:r>
-        <w:rPr>
-          <w:rFonts w:ascii="Charis SIL" w:hAnsi="Charis SIL" w:cs="Charis SIL" w:eastAsia="Charis SIL"/>
-          <w:b/>
-          <w:i w:val="0"/>
-          <w:color w:val="000000"/>
-          <w:sz w:val="20"/>
-        </w:rPr>
-        <w:t>S2 Appendix.</w:t>
-      </w:r>
-      <w:r>
-        <w:rPr>
-          <w:rFonts w:ascii="Charis SIL" w:hAnsi="Charis SIL" w:cs="Charis SIL" w:eastAsia="Charis SIL"/>
-          <w:b w:val="0"/>
-          <w:i w:val="0"/>
-          <w:color w:val="000000"/>
-          <w:sz w:val="20"/>
-        </w:rPr>
-        <w:t xml:space="preserve"> The simulated reviews. What was run, what it produced, and the statement that none of it is peer review.</w:t>
       </w:r>
     </w:p>
     <w:p>

</xml_diff>